<commit_message>
fix: escape audit set docx rendering and add FR234 signature slot
Co-Authored-By: Claude Opus 4.6 (1M context) <noreply@anthropic.com>
</commit_message>
<xml_diff>
--- a/backend/uaf_blank_set/13485/Surveillance/FR.234_Surveillance_Recertification_Audit_Notification_Form_R5&09.10.2025.docx
+++ b/backend/uaf_blank_set/13485/Surveillance/FR.234_Surveillance_Recertification_Audit_Notification_Form_R5&09.10.2025.docx
@@ -2066,6 +2066,52 @@
                 <w:lang w:val="en-GB"/>
               </w:rPr>
             </w:pPr>
+          </w:p>
+        </w:tc>
+      </w:tr>
+      <w:tr>
+        <w:tc>
+          <w:tcPr>
+            <w:tcW w:type="dxa" w:w="3256"/>
+            <w:vAlign w:val="center"/>
+          </w:tcPr>
+          <w:p>
+            <w:pPr>
+              <w:jc w:val="left"/>
+            </w:pPr>
+            <w:r>
+              <w:rPr>
+                <w:rFonts w:ascii="Times New Roman" w:hAnsi="Times New Roman"/>
+                <w:sz w:val="20"/>
+              </w:rPr>
+              <w:t>Organisation Representative Signature</w:t>
+            </w:r>
+          </w:p>
+        </w:tc>
+        <w:tc>
+          <w:tcPr>
+            <w:tcW w:type="dxa" w:w="6622"/>
+            <w:vAlign w:val="center"/>
+          </w:tcPr>
+          <w:p>
+            <w:pPr>
+              <w:jc w:val="center"/>
+            </w:pPr>
+            <w:r>
+              <w:rPr>
+                <w:rFonts w:ascii="Times New Roman" w:hAnsi="Times New Roman"/>
+                <w:sz w:val="20"/>
+              </w:rPr>
+            </w:r>
+            <w:r>
+              <w:rPr>
+                <w:rFonts w:ascii="Times New Roman" w:hAnsi="Times New Roman"/>
+                <w:i/>
+                <w:color w:val="B4B4B4"/>
+                <w:sz w:val="16"/>
+              </w:rPr>
+              <w:t>[SIG:ORG_REP]</w:t>
+            </w:r>
           </w:p>
         </w:tc>
       </w:tr>

</xml_diff>

<commit_message>
fix: align FR234 surveillance notification signature fields
Co-Authored-By: Claude Opus 4.6 (1M context) <noreply@anthropic.com>
</commit_message>
<xml_diff>
--- a/backend/uaf_blank_set/13485/Surveillance/FR.234_Surveillance_Recertification_Audit_Notification_Form_R5&09.10.2025.docx
+++ b/backend/uaf_blank_set/13485/Surveillance/FR.234_Surveillance_Recertification_Audit_Notification_Form_R5&09.10.2025.docx
@@ -2066,52 +2066,6 @@
                 <w:lang w:val="en-GB"/>
               </w:rPr>
             </w:pPr>
-          </w:p>
-        </w:tc>
-      </w:tr>
-      <w:tr>
-        <w:tc>
-          <w:tcPr>
-            <w:tcW w:type="dxa" w:w="3256"/>
-            <w:vAlign w:val="center"/>
-          </w:tcPr>
-          <w:p>
-            <w:pPr>
-              <w:jc w:val="left"/>
-            </w:pPr>
-            <w:r>
-              <w:rPr>
-                <w:rFonts w:ascii="Times New Roman" w:hAnsi="Times New Roman"/>
-                <w:sz w:val="20"/>
-              </w:rPr>
-              <w:t>Organisation Representative Signature</w:t>
-            </w:r>
-          </w:p>
-        </w:tc>
-        <w:tc>
-          <w:tcPr>
-            <w:tcW w:type="dxa" w:w="6622"/>
-            <w:vAlign w:val="center"/>
-          </w:tcPr>
-          <w:p>
-            <w:pPr>
-              <w:jc w:val="center"/>
-            </w:pPr>
-            <w:r>
-              <w:rPr>
-                <w:rFonts w:ascii="Times New Roman" w:hAnsi="Times New Roman"/>
-                <w:sz w:val="20"/>
-              </w:rPr>
-            </w:r>
-            <w:r>
-              <w:rPr>
-                <w:rFonts w:ascii="Times New Roman" w:hAnsi="Times New Roman"/>
-                <w:i/>
-                <w:color w:val="B4B4B4"/>
-                <w:sz w:val="16"/>
-              </w:rPr>
-              <w:t>[SIG:ORG_REP]</w:t>
-            </w:r>
           </w:p>
         </w:tc>
       </w:tr>
@@ -2221,57 +2175,67 @@
     </w:p>
     <w:p>
       <w:pPr>
+        <w:pStyle w:val="Heading1"/>
         <w:tabs>
-          <w:tab w:val="center" w:pos="6904"/>
-          <w:tab w:val="left" w:pos="7655"/>
+          <w:tab w:val="center" w:pos="2124"/>
+          <w:tab w:val="center" w:pos="2833"/>
+          <w:tab w:val="center" w:pos="3541"/>
+          <w:tab w:val="center" w:pos="4249"/>
+          <w:tab w:val="center" w:pos="4957"/>
+          <w:tab w:val="center" w:pos="5665"/>
+          <w:tab w:val="right" w:pos="9683"/>
         </w:tabs>
+        <w:spacing w:after="0"/>
         <w:ind w:left="-15"/>
+        <w:jc w:val="left"/>
         <w:rPr>
-          <w:rFonts w:ascii="Times New Roman" w:hAnsi="Times New Roman"/>
-          <w:sz w:val="20"/>
           <w:lang w:val="en-GB"/>
         </w:rPr>
       </w:pPr>
       <w:r>
-        <w:rPr>
-          <w:rFonts w:ascii="Times New Roman" w:hAnsi="Times New Roman"/>
-          <w:sz w:val="20"/>
-          <w:lang w:val="en-GB"/>
-        </w:rPr>
+        <w:tab/>
         <w:tab/>
       </w:r>
       <w:r>
         <w:rPr>
           <w:rFonts w:ascii="Times New Roman" w:hAnsi="Times New Roman"/>
-          <w:sz w:val="20"/>
+          <w:i/>
+          <w:color w:val="B4B4B4"/>
+          <w:sz w:val="16"/>
+        </w:rPr>
+        <w:t>[SIG:ORG_REP]</w:t>
+      </w:r>
+    </w:p>
+    <w:p>
+      <w:pPr>
+        <w:pStyle w:val="Heading1"/>
+        <w:tabs>
+          <w:tab w:val="center" w:pos="2124"/>
+          <w:tab w:val="center" w:pos="2833"/>
+          <w:tab w:val="center" w:pos="3541"/>
+          <w:tab w:val="center" w:pos="4249"/>
+          <w:tab w:val="center" w:pos="4957"/>
+          <w:tab w:val="center" w:pos="5665"/>
+          <w:tab w:val="right" w:pos="9683"/>
+        </w:tabs>
+        <w:spacing w:after="0"/>
+        <w:ind w:left="-15"/>
+        <w:jc w:val="left"/>
+        <w:rPr>
           <w:lang w:val="en-GB"/>
         </w:rPr>
-        <w:tab/>
+      </w:pPr>
+      <w:r>
+        <w:t xml:space="preserve">     </w:t>
       </w:r>
       <w:r>
         <w:rPr>
           <w:rFonts w:ascii="Times New Roman" w:hAnsi="Times New Roman"/>
-          <w:sz w:val="20"/>
-          <w:lang w:val="en-GB"/>
+          <w:i/>
+          <w:color w:val="B4B4B4"/>
+          <w:sz w:val="16"/>
         </w:rPr>
-        <w:t>Signature-Stamp</w:t>
-      </w:r>
-    </w:p>
-    <w:p>
-      <w:pPr>
-        <w:rPr>
-          <w:rFonts w:ascii="Times New Roman" w:hAnsi="Times New Roman"/>
-          <w:sz w:val="20"/>
-          <w:lang w:val="en-GB"/>
-        </w:rPr>
-      </w:pPr>
-      <w:r>
-        <w:rPr>
-          <w:rFonts w:ascii="Times New Roman" w:hAnsi="Times New Roman"/>
-          <w:sz w:val="20"/>
-          <w:lang w:val="en-GB"/>
-        </w:rPr>
-        <w:t xml:space="preserve"> </w:t>
+        <w:t>[SIG:CB_PLANNER]</w:t>
       </w:r>
     </w:p>
     <w:sectPr>

</xml_diff>